<commit_message>
Fix formatting in index.html and update notes for Tailwind CSS setup
</commit_message>
<xml_diff>
--- a/Notes/SIGMA-6.0 Notes.docx
+++ b/Notes/SIGMA-6.0 Notes.docx
@@ -24,52 +24,37 @@
     </w:p>
     <w:p>
       <w:pPr>
-        <w:jc w:val="center"/>
-        <w:rPr>
-          <w:b/>
-          <w:bCs/>
-          <w:sz w:val="40"/>
-          <w:szCs w:val="40"/>
-        </w:rPr>
-      </w:pPr>
-    </w:p>
-    <w:p>
-      <w:pPr>
-        <w:rPr>
-          <w:b/>
-          <w:bCs/>
-        </w:rPr>
-      </w:pPr>
-      <w:r>
         <w:rPr>
           <w:rFonts w:ascii="Segoe UI Emoji" w:hAnsi="Segoe UI Emoji" w:cs="Segoe UI Emoji"/>
           <w:b/>
           <w:bCs/>
-        </w:rPr>
-        <w:t>✅</w:t>
-      </w:r>
-      <w:r>
-        <w:rPr>
-          <w:b/>
-          <w:bCs/>
-        </w:rPr>
-        <w:t xml:space="preserve"> Steps to Set Up Tailwind with Vite (</w:t>
-      </w:r>
-      <w:proofErr w:type="spellStart"/>
-      <w:r>
-        <w:rPr>
-          <w:b/>
-          <w:bCs/>
-        </w:rPr>
-        <w:t>PostCSS</w:t>
-      </w:r>
-      <w:proofErr w:type="spellEnd"/>
-      <w:r>
-        <w:rPr>
-          <w:b/>
-          <w:bCs/>
-        </w:rPr>
-        <w:t xml:space="preserve"> Method)</w:t>
+          <w:u w:val="single"/>
+        </w:rPr>
+      </w:pPr>
+      <w:r>
+        <w:rPr>
+          <w:rFonts w:ascii="Segoe UI Emoji" w:hAnsi="Segoe UI Emoji" w:cs="Segoe UI Emoji"/>
+          <w:b/>
+          <w:bCs/>
+          <w:highlight w:val="cyan"/>
+          <w:u w:val="single"/>
+        </w:rPr>
+        <w:t>Chapert 70:</w:t>
+      </w:r>
+    </w:p>
+    <w:p>
+      <w:pPr>
+        <w:rPr>
+          <w:b/>
+          <w:bCs/>
+        </w:rPr>
+      </w:pPr>
+      <w:r>
+        <w:rPr>
+          <w:b/>
+          <w:bCs/>
+        </w:rPr>
+        <w:t>Steps to Set Up Tailwind with Vite (PostCSS Method)</w:t>
       </w:r>
     </w:p>
     <w:p>
@@ -88,19 +73,9 @@
       </w:r>
     </w:p>
     <w:p>
-      <w:proofErr w:type="spellStart"/>
-      <w:r>
-        <w:t>npm</w:t>
-      </w:r>
-      <w:proofErr w:type="spellEnd"/>
-      <w:r>
-        <w:t xml:space="preserve"> install -D </w:t>
-      </w:r>
-      <w:proofErr w:type="spellStart"/>
-      <w:r>
-        <w:t>tailwindcss</w:t>
-      </w:r>
-      <w:proofErr w:type="spellEnd"/>
+      <w:r>
+        <w:t>npm install -D tailwindcss</w:t>
+      </w:r>
     </w:p>
     <w:p>
       <w:pPr>
@@ -118,75 +93,28 @@
       </w:r>
     </w:p>
     <w:p>
-      <w:proofErr w:type="spellStart"/>
-      <w:r>
-        <w:t>npm</w:t>
-      </w:r>
-      <w:proofErr w:type="spellEnd"/>
-      <w:r>
-        <w:t xml:space="preserve"> install </w:t>
-      </w:r>
-      <w:proofErr w:type="spellStart"/>
-      <w:r>
-        <w:t>vite</w:t>
-      </w:r>
-      <w:proofErr w:type="spellEnd"/>
-    </w:p>
-    <w:p>
-      <w:pPr>
-        <w:rPr>
-          <w:b/>
-          <w:bCs/>
-        </w:rPr>
-      </w:pPr>
-      <w:r>
-        <w:rPr>
-          <w:b/>
-          <w:bCs/>
-        </w:rPr>
-        <w:t xml:space="preserve">3. Initialize Tailwind with </w:t>
-      </w:r>
-      <w:proofErr w:type="spellStart"/>
-      <w:r>
-        <w:rPr>
-          <w:b/>
-          <w:bCs/>
-        </w:rPr>
-        <w:t>PostCSS</w:t>
-      </w:r>
-      <w:proofErr w:type="spellEnd"/>
-      <w:r>
-        <w:rPr>
-          <w:b/>
-          <w:bCs/>
-        </w:rPr>
-        <w:t xml:space="preserve"> Config</w:t>
-      </w:r>
-    </w:p>
-    <w:p>
-      <w:proofErr w:type="spellStart"/>
-      <w:r>
-        <w:t>npx</w:t>
-      </w:r>
-      <w:proofErr w:type="spellEnd"/>
-      <w:r>
-        <w:t xml:space="preserve"> </w:t>
-      </w:r>
-      <w:proofErr w:type="spellStart"/>
-      <w:r>
-        <w:t>tailwindcss</w:t>
-      </w:r>
-      <w:proofErr w:type="spellEnd"/>
-      <w:r>
-        <w:t xml:space="preserve"> </w:t>
-      </w:r>
-      <w:proofErr w:type="spellStart"/>
-      <w:r>
-        <w:t>init</w:t>
-      </w:r>
-      <w:proofErr w:type="spellEnd"/>
-      <w:r>
-        <w:t xml:space="preserve"> -p</w:t>
+      <w:r>
+        <w:t>npm install vite</w:t>
+      </w:r>
+    </w:p>
+    <w:p>
+      <w:pPr>
+        <w:rPr>
+          <w:b/>
+          <w:bCs/>
+        </w:rPr>
+      </w:pPr>
+      <w:r>
+        <w:rPr>
+          <w:b/>
+          <w:bCs/>
+        </w:rPr>
+        <w:t>3. Initialize Tailwind with PostCSS Config</w:t>
+      </w:r>
+    </w:p>
+    <w:p>
+      <w:r>
+        <w:t>npx tailwindcss init -p</w:t>
       </w:r>
     </w:p>
     <w:p>
@@ -244,22 +172,13 @@
       <w:r>
         <w:t>"./</w:t>
       </w:r>
-      <w:proofErr w:type="spellStart"/>
       <w:proofErr w:type="gramEnd"/>
       <w:r>
-        <w:t>src</w:t>
-      </w:r>
-      <w:proofErr w:type="spellEnd"/>
-      <w:r>
-        <w:t>/**/</w:t>
+        <w:t>src/**/</w:t>
       </w:r>
       <w:proofErr w:type="gramStart"/>
       <w:r>
-        <w:t>*.{</w:t>
-      </w:r>
-      <w:proofErr w:type="spellStart"/>
-      <w:r>
-        <w:t>js,ts</w:t>
+        <w:t>*.{js,ts</w:t>
       </w:r>
       <w:proofErr w:type="gramEnd"/>
       <w:r>
@@ -269,7 +188,6 @@
       <w:r>
         <w:t>jsx,tsx</w:t>
       </w:r>
-      <w:proofErr w:type="spellEnd"/>
       <w:proofErr w:type="gramEnd"/>
       <w:r>
         <w:t>}"]</w:t>
@@ -339,7 +257,6 @@
         </w:rPr>
         <w:t xml:space="preserve">6. Edit </w:t>
       </w:r>
-      <w:proofErr w:type="spellStart"/>
       <w:proofErr w:type="gramStart"/>
       <w:r>
         <w:rPr>
@@ -348,7 +265,6 @@
         </w:rPr>
         <w:t>package.json</w:t>
       </w:r>
-      <w:proofErr w:type="spellEnd"/>
       <w:proofErr w:type="gramEnd"/>
     </w:p>
     <w:p>
@@ -363,15 +279,7 @@
     </w:p>
     <w:p>
       <w:r>
-        <w:t xml:space="preserve">  "start": "</w:t>
-      </w:r>
-      <w:proofErr w:type="spellStart"/>
-      <w:r>
-        <w:t>vite</w:t>
-      </w:r>
-      <w:proofErr w:type="spellEnd"/>
-      <w:r>
-        <w:t>"</w:t>
+        <w:t xml:space="preserve">  "start": "vite"</w:t>
       </w:r>
     </w:p>
     <w:p>
@@ -401,23 +309,7 @@
     </w:p>
     <w:p>
       <w:r>
-        <w:t xml:space="preserve">&lt;link </w:t>
-      </w:r>
-      <w:proofErr w:type="spellStart"/>
-      <w:r>
-        <w:t>rel</w:t>
-      </w:r>
-      <w:proofErr w:type="spellEnd"/>
-      <w:r>
-        <w:t xml:space="preserve">="stylesheet" </w:t>
-      </w:r>
-      <w:proofErr w:type="spellStart"/>
-      <w:r>
-        <w:t>href</w:t>
-      </w:r>
-      <w:proofErr w:type="spellEnd"/>
-      <w:r>
-        <w:t>="/style.css"&gt;</w:t>
+        <w:t>&lt;link rel="stylesheet" href="/style.css"&gt;</w:t>
       </w:r>
     </w:p>
     <w:p>
@@ -436,13 +328,8 @@
       </w:r>
     </w:p>
     <w:p>
-      <w:proofErr w:type="spellStart"/>
-      <w:r>
-        <w:t>npm</w:t>
-      </w:r>
-      <w:proofErr w:type="spellEnd"/>
-      <w:r>
-        <w:t xml:space="preserve"> run start</w:t>
+      <w:r>
+        <w:t>npm run start</w:t>
       </w:r>
     </w:p>
     <w:p/>
@@ -1216,6 +1103,7 @@
   <w:style w:type="character" w:default="1" w:styleId="DefaultParagraphFont">
     <w:name w:val="Default Paragraph Font"/>
     <w:uiPriority w:val="1"/>
+    <w:semiHidden/>
     <w:unhideWhenUsed/>
   </w:style>
   <w:style w:type="table" w:default="1" w:styleId="TableNormal">

</xml_diff>